<commit_message>
Fase 4: system versioning — v1.0.0 (Release 0)
- js/core/version.js: single source of truth (COMPASSO_VERSAO
  {numero, release, data}, SemVer). Helpers versaoCompassoCurta/Longa +
  aplicarVersaoCompasso() stamps every [data-compasso-versao] element.
- Shown on the login footer, sidebar footer and home screen. Called from
  js/main.js on load.
- CHANGELOG.md (Keep a Changelog) with the [1.0.0] baseline and the
  release procedure. CLAUDE.md gains a "Versionamento" section.
- Manual note: where the version is shown.

Co-Authored-By: Claude Sonnet 5 <noreply@anthropic.com>
</commit_message>
<xml_diff>
--- a/docs/Manual_Funcional_COMPASSO.docx
+++ b/docs/Manual_Funcional_COMPASSO.docx
@@ -641,6 +641,11 @@
     <w:p>
       <w:r>
         <w:t>A tela de Detalhamento do Projeto não tem link fixo no menu — é acessada clicando no código de qualquer projeto no Dashboard, na Consulta de Projetos, no Cronograma ou em outras listagens (ver 12.10).</w:t>
+      </w:r>
+    </w:p>
+    <w:p>
+      <w:r>
+        <w:t>A versão do sistema (ex.: "Versão 1.0.0 · Release 0") aparece no rodapé da tela de login, no rodapé do menu lateral e na tela inicial. É o número a citar em qualquer report de problema.</w:t>
       </w:r>
     </w:p>
     <w:p>

</xml_diff>

<commit_message>
docs(manual): seção inicial "Roteiro de Instalação e Primeira Configuração"
Manual v8.0. Nova seção antes da 1, com a ordem recomendada de cadastros
numa instalação nova:
- Bloco A (Cognitionis/PROPRIETÁRIO): Dados da Empresa Licenciada,
  Licenciamento de Módulos, criação do 1º ADMINISTRADOR do cliente
  (função restrita ao master da Cognitionis).
- Bloco B (Administrador do cliente): Período/Abertura do Ano Fiscal,
  cadastros mestres em ordem de dependência, motor de workflow, parâmetros
  de orçamento, organização de acesso, e-mail, planejamento estratégico.
- Bloco C: primeira demanda; ponteiro para carga_zero.sql como reset.

Numeração das seções existentes inalterada (seção inicial sem número).

Co-Authored-By: Claude Sonnet 5 <noreply@anthropic.com>
</commit_message>
<xml_diff>
--- a/docs/Manual_Funcional_COMPASSO.docx
+++ b/docs/Manual_Funcional_COMPASSO.docx
@@ -39,12 +39,12 @@
     </w:p>
     <w:p>
       <w:r>
-        <w:t>Versão 7.0 — 3 de setembro de 2026</w:t>
-      </w:r>
-    </w:p>
-    <w:p>
-      <w:r>
-        <w:t>Novidades da versão 7.0: (Proprietário) "Dados da Empresa Licenciada" (2.7) — cadastro da empresa que licenciou o Compasso, com nome/logo/cor exibidos no login, na tela inicial e no cabeçalho, e a vigência da licença: configuração inicial bloqueante, aviso preventivo de vencimento, tela "Licença Expirada" e renovação por código assinado. O grupo de menus de cada módulo passou a vir de uma tabela de configuração (não mais fixo no código); o Financeiro agrupa todas as funções de orçamento (Controle Orçamentário, Ajuste de Orçamento, Validação de Trade-off, Aprovar Demanda Extraordinária), e Abertura/Período do Ano Fiscal são de núcleo. Novidades da versão 6.0: (Administração) "Controle Orçamentário" — parâmetro que define se o trade-off da Demanda Extraordinária considera todos os projetos do Ano Fiscal (padrão), só os da mesma Área ou só os do mesmo Produto do projeto extraordinário; (Administração) "Período do Ano Fiscal" — o mês em que o Ano Fiscal começa deixou de ser fixo (abril) e passou a ser configurável, com vigência; (Ano Fiscal) "Validação de Trade-off Extraordinário" — fila de aprovação para as simulações de trade-off que cruzam Área/Produto. Novidades da versão 5.0 (ainda vigentes): Versão do manual sob a marca Compasso. Novidades acumuladas nesta revisão: tela de Fechamento Ano Fiscal (menu Ano Fiscal), com duas abas — a avaliação consolidada do ano com o botão "Fechar Ano Fiscal" (fechamento formal, com log, distinto do fechamento do orçamento) e a decisão projeto a projeto (Carryover Desenvolvimento / Carryover Hold / Cancelar / Reverter) — substituindo a antiga tela "Projetos Carry Over"; o seletor de Ano Fiscal do Dashboard/Roadmap/Financeiro/Consulta passa a ser alimentado pela configuração de Anos Fiscais (lista de todos os AFs cadastrados + "Todos" + "Pipeline"), não mais pela data do dia; o Quadro de Orçamento ganhou duas linhas de contagem de projetos e separou o Carry Over em "Em Andamento" e "Em Hold"; o quadro "Projetos na Criação do Ano Fiscal" ganhou a linha de cancelados; o Detalhamento do Projeto teve o cabeçalho reorganizado e ganhou a seção "Decisões de Fechamento"; e o Termo de Aceite do Go-Live passou a ser pré-requisito real da conclusão do projeto, não podendo ser registrado antes dos 100% de evolução. Novidades das revisões anteriores, ainda vigentes: papel PROPRIETÁRIO e Licenciamento de Módulos; permissões por atividade com quatro verbos (Consultar, Incluir, Alterar, Deletar); proteção no banco de dados (RLS) ativada nas tabelas centrais de controle de acesso; Cadastro de Produtos e associação obrigatória de Produto à demanda; Agrupamento de Orçamento por Ano Fiscal, Área ou Produto; tela de Ajuste de Orçamento; e padronização de nomenclatura (Ano Fiscal, Requerimentos, Especificação, Execução, Retorno/Benefícios de Projeto).</w:t>
+        <w:t>Versão 8.0 — 3 de setembro de 2026</w:t>
+      </w:r>
+    </w:p>
+    <w:p>
+      <w:r>
+        <w:t>Novidades da versão 8.0: nova seção inicial "Roteiro de Instalação e Primeira Configuração" — a ordem recomendada de cadastros numa instalação nova, do cadastro da empresa licenciada e dos módulos (feito pela Cognitionis) até a base pronta para a primeira demanda (feito pelo Administrador do cliente). Novidades da versão 7.0: (Proprietário) "Dados da Empresa Licenciada" (2.7) — cadastro da empresa que licenciou o Compasso, com nome/logo/cor exibidos no login, na tela inicial e no cabeçalho, e a vigência da licença: configuração inicial bloqueante, aviso preventivo de vencimento, tela "Licença Expirada" e renovação por código assinado. O grupo de menus de cada módulo passou a vir de uma tabela de configuração (não mais fixo no código); o Financeiro agrupa todas as funções de orçamento (Controle Orçamentário, Ajuste de Orçamento, Validação de Trade-off, Aprovar Demanda Extraordinária), e Abertura/Período do Ano Fiscal são de núcleo. Novidades da versão 6.0: (Administração) "Controle Orçamentário" — parâmetro que define se o trade-off da Demanda Extraordinária considera todos os projetos do Ano Fiscal (padrão), só os da mesma Área ou só os do mesmo Produto do projeto extraordinário; (Administração) "Período do Ano Fiscal" — o mês em que o Ano Fiscal começa deixou de ser fixo (abril) e passou a ser configurável, com vigência; (Ano Fiscal) "Validação de Trade-off Extraordinário" — fila de aprovação para as simulações de trade-off que cruzam Área/Produto. Novidades da versão 5.0 (ainda vigentes): Versão do manual sob a marca Compasso. Novidades acumuladas nesta revisão: tela de Fechamento Ano Fiscal (menu Ano Fiscal), com duas abas — a avaliação consolidada do ano com o botão "Fechar Ano Fiscal" (fechamento formal, com log, distinto do fechamento do orçamento) e a decisão projeto a projeto (Carryover Desenvolvimento / Carryover Hold / Cancelar / Reverter) — substituindo a antiga tela "Projetos Carry Over"; o seletor de Ano Fiscal do Dashboard/Roadmap/Financeiro/Consulta passa a ser alimentado pela configuração de Anos Fiscais (lista de todos os AFs cadastrados + "Todos" + "Pipeline"), não mais pela data do dia; o Quadro de Orçamento ganhou duas linhas de contagem de projetos e separou o Carry Over em "Em Andamento" e "Em Hold"; o quadro "Projetos na Criação do Ano Fiscal" ganhou a linha de cancelados; o Detalhamento do Projeto teve o cabeçalho reorganizado e ganhou a seção "Decisões de Fechamento"; e o Termo de Aceite do Go-Live passou a ser pré-requisito real da conclusão do projeto, não podendo ser registrado antes dos 100% de evolução. Novidades das revisões anteriores, ainda vigentes: papel PROPRIETÁRIO e Licenciamento de Módulos; permissões por atividade com quatro verbos (Consultar, Incluir, Alterar, Deletar); proteção no banco de dados (RLS) ativada nas tabelas centrais de controle de acesso; Cadastro de Produtos e associação obrigatória de Produto à demanda; Agrupamento de Orçamento por Ano Fiscal, Área ou Produto; tela de Ajuste de Orçamento; e padronização de nomenclatura (Ano Fiscal, Requerimentos, Especificação, Execução, Retorno/Benefícios de Projeto).</w:t>
       </w:r>
     </w:p>
     <w:p>
@@ -58,6 +58,161 @@
     <w:p>
       <w:r>
         <w:t>Clique com o botão direito sobre o sumário e escolha "Atualizar Campo" para gerar/atualizar o sumário.</w:t>
+      </w:r>
+    </w:p>
+    <w:p>
+      <w:pPr>
+        <w:pStyle w:val="Heading1"/>
+      </w:pPr>
+      <w:r>
+        <w:t>Roteiro de Instalação e Primeira Configuração</w:t>
+      </w:r>
+    </w:p>
+    <w:p>
+      <w:r>
+        <w:t>Esta seção descreve, na ordem recomendada, o que precisa ser cadastrado numa instalação nova do Compasso — da base "carga zero" (só a estrutura do produto e o usuário PROPRIETÁRIO) até o sistema pronto para receber a primeira demanda. Cada passo indica a tela e a seção do manual onde ela é detalhada. A regra geral é: primeiro a Cognitionis prepara a licença e o acesso mestre; depois o Administrador do cliente monta os cadastros, sempre do que não depende de nada para o que depende do anterior.</w:t>
+      </w:r>
+    </w:p>
+    <w:p>
+      <w:r>
+        <w:t>Papéis nesta seção: "master da Cognitionis" é o usuário PROPRIETÁRIO, criado pela Cognitionis na entrega e associado à área reservada COGNITIONIS (essa área é fixa do sistema — não aparece em nenhum seletor e o cadastro de Áreas recusa esse nome). "Administrador do cliente" é o primeiro usuário do cliente, que recebe a função ADMINISTRADOR.</w:t>
+      </w:r>
+    </w:p>
+    <w:p>
+      <w:pPr>
+        <w:pStyle w:val="Heading2"/>
+      </w:pPr>
+      <w:r>
+        <w:t>Bloco A — Preparação pela Cognitionis (master)</w:t>
+      </w:r>
+    </w:p>
+    <w:p>
+      <w:r>
+        <w:t>Feito uma única vez, pelo PROPRIETÁRIO, antes de entregar o sistema ao cliente.</w:t>
+      </w:r>
+    </w:p>
+    <w:p>
+      <w:pPr>
+        <w:pStyle w:val="ListBullet"/>
+      </w:pPr>
+      <w:r>
+        <w:t>A1. Dados da Empresa Licenciada (menu Proprietário &gt; Dados da Empresa Licenciada — ver 2.7). Enquanto não estiver preenchida, o sistema abre numa tela de configuração bloqueante e nenhum outro perfil entra. Informar CNPJ, Razão Social, Nome Fantasia, Data de Aquisição, Início e Término da Vigência, Nome para Cabeçalhos, Cor e Logo.</w:t>
+      </w:r>
+    </w:p>
+    <w:p>
+      <w:pPr>
+        <w:pStyle w:val="ListBullet"/>
+      </w:pPr>
+      <w:r>
+        <w:t>A2. Licenciamento de Módulos (menu Proprietário &gt; Licenciamento de Módulos — ver 2.6 e 13.6). Ligar apenas os módulos contratados pelo cliente (Workflow, E-mail, Financeiro, Planejamento Estratégico). O núcleo está sempre ligado. Telas de módulo desligado não aparecem para ninguém.</w:t>
+      </w:r>
+    </w:p>
+    <w:p>
+      <w:pPr>
+        <w:pStyle w:val="ListBullet"/>
+      </w:pPr>
+      <w:r>
+        <w:t>A3. Primeiro usuário ADMINISTRADOR do cliente. Ordem: (a) em Parâmetros e Cadastros &gt; Cargos (14.9), garantir pelo menos um cargo; (b) em Perfis de Acesso &gt; Usuários (13.1), criar a conta do Administrador do cliente com senha provisória; (c) em Perfis de Acesso &gt; Funções e Permissões (13.2), criar a função ADMINISTRADOR marcada como "Acesso Irrestrito"; (d) em Perfis de Acesso &gt; Atribuição de Funções aos Usuários (13.3), vincular a função ADMINISTRADOR a essa conta.</w:t>
+      </w:r>
+    </w:p>
+    <w:p>
+      <w:r>
+        <w:t>A função ADMINISTRADOR e a sua atribuição são responsabilidade exclusiva do master da Cognitionis. O cliente nunca cria nem concede ADMINISTRADOR a si mesmo; a partir daí, o Administrador do cliente cuida dos papéis operacionais (Governança, Gestor de TI, PMO, solicitantes, etc.).</w:t>
+      </w:r>
+    </w:p>
+    <w:p>
+      <w:pPr>
+        <w:pStyle w:val="Heading2"/>
+      </w:pPr>
+      <w:r>
+        <w:t>Bloco B — Configuração pelo Administrador do cliente</w:t>
+      </w:r>
+    </w:p>
+    <w:p>
+      <w:r>
+        <w:t>Nesta ordem. Cada item só depende dos anteriores.</w:t>
+      </w:r>
+    </w:p>
+    <w:p>
+      <w:pPr>
+        <w:pStyle w:val="ListBullet"/>
+      </w:pPr>
+      <w:r>
+        <w:t>B1. Período do Ano Fiscal (Administração &gt; Período do Ano Fiscal — 15.10). Só se o Ano Fiscal do cliente NÃO começar em abril. Fazer antes de abrir o Ano Fiscal, porque quarters e rótulos "AFxxxx" derivam desse mês.</w:t>
+      </w:r>
+    </w:p>
+    <w:p>
+      <w:pPr>
+        <w:pStyle w:val="ListBullet"/>
+      </w:pPr>
+      <w:r>
+        <w:t>B2. Abertura Ano Fiscal (Ano Fiscal &gt; Abertura Ano Fiscal — 4.1). Numa base sem nenhum Ano Fiscal, usar o botão que inicializa o Ano Fiscal corrente já aberto para demandas. Sem isso, as telas que dependem de Ano Fiscal (Formalizar Demanda, Planejamento Estratégico) não têm o que listar.</w:t>
+      </w:r>
+    </w:p>
+    <w:p>
+      <w:pPr>
+        <w:pStyle w:val="ListBullet"/>
+      </w:pPr>
+      <w:r>
+        <w:t>B3. Cadastros mestres, nesta sequência de dependência (todos em Parâmetros e Cadastros — seção 14): Cargos (14.9) → Áreas Solicitantes (14.2) → Pessoas Solicitantes (14.3, dependem de Área) → Cadastro de Porte (14.4) → Tipos de Projeto (14.5) → Cadastro de Produtos (14.6) → Retorno / Benefícios de Projeto (14.7).</w:t>
+      </w:r>
+    </w:p>
+    <w:p>
+      <w:pPr>
+        <w:pStyle w:val="ListBullet"/>
+      </w:pPr>
+      <w:r>
+        <w:t>B4. Motor de workflow (Administração — seção 15): revisar Fases e Etapas do Workflow (15.1) — ordem das etapas, gerente responsável por fase, flag de decisão de aprovação — e conferir a matriz de SLA por etapa e porte (15.2, editada dentro de Fases e Etapas).</w:t>
+      </w:r>
+    </w:p>
+    <w:p>
+      <w:pPr>
+        <w:pStyle w:val="ListBullet"/>
+      </w:pPr>
+      <w:r>
+        <w:t>B5. Parâmetros de orçamento: Percentual de Bloqueio de Orçamento (15.6) e Controle Orçamentário (15.9 — modo Ano Fiscal, Área ou Produto; o padrão é Ano Fiscal).</w:t>
+      </w:r>
+    </w:p>
+    <w:p>
+      <w:pPr>
+        <w:pStyle w:val="ListBullet"/>
+      </w:pPr>
+      <w:r>
+        <w:t>B6. Organização de acesso do cliente, nesta ordem: Funções e Permissões (13.2 — criar os papéis operacionais e marcar as atividades de cada um) → Usuários (13.1 — as contas, cada uma com cargo e área) → Atribuição de Funções aos Usuários (13.3) → Responsáveis por Atividade (13.4 — quais usuários podem ser designados em cada etapa) → Restrição de Área por Atividade (13.5 — opcional, se quiser limitar telas por área do usuário).</w:t>
+      </w:r>
+    </w:p>
+    <w:p>
+      <w:pPr>
+        <w:pStyle w:val="ListBullet"/>
+      </w:pPr>
+      <w:r>
+        <w:t>B7. E-mail (Administração — só se o módulo E-mail estiver ligado): Gestão de Templates (15.3 — os modelos) → Gestão do Fluxo (15.4 — em cada ponto de disparo, definir destinatário, remetente e template, e então ligar a linha) → ligar a Chave Geral de Envio → Gestão de Fila de Envio (15.5) para processar os e-mails.</w:t>
+      </w:r>
+    </w:p>
+    <w:p>
+      <w:pPr>
+        <w:pStyle w:val="ListBullet"/>
+      </w:pPr>
+      <w:r>
+        <w:t>B8. Planejamento Estratégico (Parâmetros e Cadastros &gt; Planejamento Estratégico — 14.8): cadastrar os Pilares (cada um em um Ano Fiscal já configurado) e, dentro deles, as Iniciativas.</w:t>
+      </w:r>
+    </w:p>
+    <w:p>
+      <w:pPr>
+        <w:pStyle w:val="Heading2"/>
+      </w:pPr>
+      <w:r>
+        <w:t>Bloco C — Início da operação</w:t>
+      </w:r>
+    </w:p>
+    <w:p>
+      <w:r>
+        <w:t>Com os blocos A e B concluídos, a base está pronta. O Administrador (ou o perfil de negócio habilitado) formaliza a primeira demanda em Business Case &gt; Formalizar Demanda (seção 5) e o projeto segue a sequência de workflow descrita nas seções 3 a 8.</w:t>
+      </w:r>
+    </w:p>
+    <w:p>
+      <w:r>
+        <w:t>Ao restaurar um backup ou repetir o teste de instalação nova, o script sql/2026-09-03_carga_zero.sql devolve a base a este ponto de partida: só a estrutura do produto, o usuário PROPRIETÁRIO na área COGNITIONIS, e os gatilhos de e-mail zerados e desligados.</w:t>
       </w:r>
     </w:p>
     <w:p>

</xml_diff>

<commit_message>
docs(manual): A3 reforça a atribuição da função; Dev Tools = só Proprietário
- Roteiro de Instalação, passo A3(d): deixa explícito que ATRIBUIR a
  função ADMINISTRADOR à conta é obrigatório — criar usuário e criar
  função não bastam.
- Seções 1.2, 2.2 e 15.8: "Ferramentas de Dev" descrita como exclusiva
  do PROPRIETÁRIO (não mais "quem tem Acesso Irrestrito").

Co-Authored-By: Claude Sonnet 5 <noreply@anthropic.com>
</commit_message>
<xml_diff>
--- a/docs/Manual_Funcional_COMPASSO.docx
+++ b/docs/Manual_Funcional_COMPASSO.docx
@@ -44,7 +44,7 @@
     </w:p>
     <w:p>
       <w:r>
-        <w:t>Novidades da versão 8.0: nova seção inicial "Roteiro de Instalação e Primeira Configuração" — a ordem recomendada de cadastros numa instalação nova, do cadastro da empresa licenciada e dos módulos (feito pela Cognitionis) até a base pronta para a primeira demanda (feito pelo Administrador do cliente). Novidades da versão 7.0: (Proprietário) "Dados da Empresa Licenciada" (2.7) — cadastro da empresa que licenciou o Compasso, com nome/logo/cor exibidos no login, na tela inicial e no cabeçalho, e a vigência da licença: configuração inicial bloqueante, aviso preventivo de vencimento, tela "Licença Expirada" e renovação por código assinado. O grupo de menus de cada módulo passou a vir de uma tabela de configuração (não mais fixo no código); o Financeiro agrupa todas as funções de orçamento (Controle Orçamentário, Ajuste de Orçamento, Validação de Trade-off, Aprovar Demanda Extraordinária), e Abertura/Período do Ano Fiscal são de núcleo. Novidades da versão 6.0: (Administração) "Controle Orçamentário" — parâmetro que define se o trade-off da Demanda Extraordinária considera todos os projetos do Ano Fiscal (padrão), só os da mesma Área ou só os do mesmo Produto do projeto extraordinário; (Administração) "Período do Ano Fiscal" — o mês em que o Ano Fiscal começa deixou de ser fixo (abril) e passou a ser configurável, com vigência; (Ano Fiscal) "Validação de Trade-off Extraordinário" — fila de aprovação para as simulações de trade-off que cruzam Área/Produto. Novidades da versão 5.0 (ainda vigentes): Versão do manual sob a marca Compasso. Novidades acumuladas nesta revisão: tela de Fechamento Ano Fiscal (menu Ano Fiscal), com duas abas — a avaliação consolidada do ano com o botão "Fechar Ano Fiscal" (fechamento formal, com log, distinto do fechamento do orçamento) e a decisão projeto a projeto (Carryover Desenvolvimento / Carryover Hold / Cancelar / Reverter) — substituindo a antiga tela "Projetos Carry Over"; o seletor de Ano Fiscal do Dashboard/Roadmap/Financeiro/Consulta passa a ser alimentado pela configuração de Anos Fiscais (lista de todos os AFs cadastrados + "Todos" + "Pipeline"), não mais pela data do dia; o Quadro de Orçamento ganhou duas linhas de contagem de projetos e separou o Carry Over em "Em Andamento" e "Em Hold"; o quadro "Projetos na Criação do Ano Fiscal" ganhou a linha de cancelados; o Detalhamento do Projeto teve o cabeçalho reorganizado e ganhou a seção "Decisões de Fechamento"; e o Termo de Aceite do Go-Live passou a ser pré-requisito real da conclusão do projeto, não podendo ser registrado antes dos 100% de evolução. Novidades das revisões anteriores, ainda vigentes: papel PROPRIETÁRIO e Licenciamento de Módulos; permissões por atividade com quatro verbos (Consultar, Incluir, Alterar, Deletar); proteção no banco de dados (RLS) ativada nas tabelas centrais de controle de acesso; Cadastro de Produtos e associação obrigatória de Produto à demanda; Agrupamento de Orçamento por Ano Fiscal, Área ou Produto; tela de Ajuste de Orçamento; e padronização de nomenclatura (Ano Fiscal, Requerimentos, Especificação, Execução, Retorno/Benefícios de Projeto).</w:t>
+        <w:t>Novidades da versão 8.0: nova seção inicial "Roteiro de Instalação e Primeira Configuração" — a ordem recomendada de cadastros numa instalação nova, do cadastro da empresa licenciada e dos módulos (feito pela Cognitionis) até a base pronta para a primeira demanda (feito pelo Administrador do cliente); e "Ferramentas de Dev" passou a ser exclusiva do PROPRIETÁRIO (antes bastava ter Acesso Irrestrito). Novidades da versão 7.0: (Proprietário) "Dados da Empresa Licenciada" (2.7) — cadastro da empresa que licenciou o Compasso, com nome/logo/cor exibidos no login, na tela inicial e no cabeçalho, e a vigência da licença: configuração inicial bloqueante, aviso preventivo de vencimento, tela "Licença Expirada" e renovação por código assinado. O grupo de menus de cada módulo passou a vir de uma tabela de configuração (não mais fixo no código); o Financeiro agrupa todas as funções de orçamento (Controle Orçamentário, Ajuste de Orçamento, Validação de Trade-off, Aprovar Demanda Extraordinária), e Abertura/Período do Ano Fiscal são de núcleo. Novidades da versão 6.0: (Administração) "Controle Orçamentário" — parâmetro que define se o trade-off da Demanda Extraordinária considera todos os projetos do Ano Fiscal (padrão), só os da mesma Área ou só os do mesmo Produto do projeto extraordinário; (Administração) "Período do Ano Fiscal" — o mês em que o Ano Fiscal começa deixou de ser fixo (abril) e passou a ser configurável, com vigência; (Ano Fiscal) "Validação de Trade-off Extraordinário" — fila de aprovação para as simulações de trade-off que cruzam Área/Produto. Novidades da versão 5.0 (ainda vigentes): Versão do manual sob a marca Compasso. Novidades acumuladas nesta revisão: tela de Fechamento Ano Fiscal (menu Ano Fiscal), com duas abas — a avaliação consolidada do ano com o botão "Fechar Ano Fiscal" (fechamento formal, com log, distinto do fechamento do orçamento) e a decisão projeto a projeto (Carryover Desenvolvimento / Carryover Hold / Cancelar / Reverter) — substituindo a antiga tela "Projetos Carry Over"; o seletor de Ano Fiscal do Dashboard/Roadmap/Financeiro/Consulta passa a ser alimentado pela configuração de Anos Fiscais (lista de todos os AFs cadastrados + "Todos" + "Pipeline"), não mais pela data do dia; o Quadro de Orçamento ganhou duas linhas de contagem de projetos e separou o Carry Over em "Em Andamento" e "Em Hold"; o quadro "Projetos na Criação do Ano Fiscal" ganhou a linha de cancelados; o Detalhamento do Projeto teve o cabeçalho reorganizado e ganhou a seção "Decisões de Fechamento"; e o Termo de Aceite do Go-Live passou a ser pré-requisito real da conclusão do projeto, não podendo ser registrado antes dos 100% de evolução. Novidades das revisões anteriores, ainda vigentes: papel PROPRIETÁRIO e Licenciamento de Módulos; permissões por atividade com quatro verbos (Consultar, Incluir, Alterar, Deletar); proteção no banco de dados (RLS) ativada nas tabelas centrais de controle de acesso; Cadastro de Produtos e associação obrigatória de Produto à demanda; Agrupamento de Orçamento por Ano Fiscal, Área ou Produto; tela de Ajuste de Orçamento; e padronização de nomenclatura (Ano Fiscal, Requerimentos, Especificação, Execução, Retorno/Benefícios de Projeto).</w:t>
       </w:r>
     </w:p>
     <w:p>
@@ -112,7 +112,7 @@
         <w:pStyle w:val="ListBullet"/>
       </w:pPr>
       <w:r>
-        <w:t>A3. Primeiro usuário ADMINISTRADOR do cliente. Ordem: (a) em Parâmetros e Cadastros &gt; Cargos (14.9), garantir pelo menos um cargo; (b) em Perfis de Acesso &gt; Usuários (13.1), criar a conta do Administrador do cliente com senha provisória; (c) em Perfis de Acesso &gt; Funções e Permissões (13.2), criar a função ADMINISTRADOR marcada como "Acesso Irrestrito"; (d) em Perfis de Acesso &gt; Atribuição de Funções aos Usuários (13.3), vincular a função ADMINISTRADOR a essa conta.</w:t>
+        <w:t>A3. Primeiro usuário ADMINISTRADOR do cliente. Ordem: (a) em Parâmetros e Cadastros &gt; Cargos (14.9), garantir pelo menos um cargo; (b) em Perfis de Acesso &gt; Usuários (13.1), criar a conta do Administrador do cliente com senha provisória; (c) em Perfis de Acesso &gt; Funções e Permissões (13.2), criar a função ADMINISTRADOR marcada como "Acesso Irrestrito"; (d) em Perfis de Acesso &gt; Atribuição de Funções aos Usuários (13.3), ATRIBUIR a função ADMINISTRADOR à conta criada no passo (b). Este passo (d) é obrigatório: sem a atribuição, a conta entra no sistema sem permissão nenhuma — criar o usuário e criar a função não bastam.</w:t>
       </w:r>
     </w:p>
     <w:p>
@@ -774,7 +774,7 @@
         <w:pStyle w:val="ListBullet"/>
       </w:pPr>
       <w:r>
-        <w:t>Ferramentas de Dev — grupo próprio, restrito a quem tem Acesso Irrestrito.</w:t>
+        <w:t>Ferramentas de Dev — grupo próprio, exclusivo do PROPRIETÁRIO.</w:t>
       </w:r>
     </w:p>
     <w:p>
@@ -889,7 +889,7 @@
     </w:p>
     <w:p>
       <w:r>
-        <w:t>Só "Ferramentas de Dev" continua sendo exclusivo de quem tem Acesso Irrestrito, mesmo que a atividade seja marcada para outro papel — é a única tela com ações destrutivas (apagar dados de teste em massa).</w:t>
+        <w:t>"Ferramentas de Dev" é exclusivo do PROPRIETÁRIO — não basta ter Acesso Irrestrito nem ser Administrador, e não adianta a atividade estar marcada para outro papel. É a única tela com ações destrutivas (apagar dados de teste em massa), então fica no papel mais privilegiado; tanto a visibilidade do menu quanto cada ação dentro dela reconferem que o usuário é Proprietário.</w:t>
       </w:r>
     </w:p>
     <w:p>
@@ -3162,7 +3162,7 @@
     </w:p>
     <w:p>
       <w:r>
-        <w:t>Grupo próprio no menu, restrito a quem tem Acesso Irrestrito. Ferramentas de reinício/limpeza de dados de teste (resetar para Fase 1, limpar base mantendo só um AF, limpeza total, exclusão seletiva) e criação de projetos de teste já em qualquer fase — inclusive com Produto, que é obrigatório.</w:t>
+        <w:t>Grupo próprio no menu, exclusivo do PROPRIETÁRIO (Administrador e Acesso Irrestrito não entram). Ferramentas de reinício/limpeza de dados de teste (resetar para Fase 1, limpar base mantendo só um AF, limpeza total, exclusão seletiva) e criação de projetos de teste já em qualquer fase — inclusive com Produto, que é obrigatório.</w:t>
       </w:r>
     </w:p>
     <w:p>

</xml_diff>

<commit_message>
feat(cargos): permitir editar nome enquanto não estiver em uso
Mesmo padrão de Produtos/Tipos de Projeto: botão Editar abre o formulário
preenchido; só grava se nenhum usuário ainda tem o cargo
(perfis_usuarios.cargo_id), com recheck no momento de salvar. O cargo
"ANALISTA DE TECNOLOGIA" é blindado (badge "reservado", sem botão
Editar): o trigger handle_new_user procura o cargo por esse nome exato
pra todo usuário novo, renomear quebraria a criação de usuários.

Manual 14.9 atualizado.

Co-Authored-By: Claude Sonnet 5 <noreply@anthropic.com>
</commit_message>
<xml_diff>
--- a/docs/Manual_Funcional_COMPASSO.docx
+++ b/docs/Manual_Funcional_COMPASSO.docx
@@ -44,7 +44,7 @@
     </w:p>
     <w:p>
       <w:r>
-        <w:t>Novidades da versão 9.0: nova caixa "Ignora Restrição de Área" no cadastro de Funções (2.5/13.2) — exceção concedível por papel, sem dar Acesso Irrestrito; Cadastro de Produtos e Tipos de Projeto passam a permitir editar nome/descrição enquanto não estiverem em uso (14.5/14.6); Percentual de Bloqueio de Orçamento (15.6) passa a mostrar o valor vigente e o histórico de alterações; e a coluna Fase da Gestão do Fluxo de E-mail (15.4) mostra os nomes padronizados (Requerimentos, Especificação, Execução). Novidades da versão 8.0: nova seção inicial "Roteiro de Instalação e Primeira Configuração" — a ordem recomendada de cadastros numa instalação nova, do cadastro da empresa licenciada e dos módulos (feito pela Cognitionis) até a base pronta para a primeira demanda (feito pelo Administrador do cliente); e "Ferramentas de Dev" passou a ser exclusiva do PROPRIETÁRIO (antes bastava ter Acesso Irrestrito). Novidades da versão 7.0: (Proprietário) "Dados da Empresa Licenciada" (2.7) — cadastro da empresa que licenciou o Compasso, com nome/logo/cor exibidos no login, na tela inicial e no cabeçalho, e a vigência da licença: configuração inicial bloqueante, aviso preventivo de vencimento, tela "Licença Expirada" e renovação por código assinado. O grupo de menus de cada módulo passou a vir de uma tabela de configuração (não mais fixo no código); o Financeiro agrupa todas as funções de orçamento (Controle Orçamentário, Ajuste de Orçamento, Validação de Trade-off, Aprovar Demanda Extraordinária), e Abertura/Período do Ano Fiscal são de núcleo. Novidades da versão 6.0: (Administração) "Controle Orçamentário" — parâmetro que define se o trade-off da Demanda Extraordinária considera todos os projetos do Ano Fiscal (padrão), só os da mesma Área ou só os do mesmo Produto do projeto extraordinário; (Administração) "Período do Ano Fiscal" — o mês em que o Ano Fiscal começa deixou de ser fixo (abril) e passou a ser configurável, com vigência; (Ano Fiscal) "Validação de Trade-off Extraordinário" — fila de aprovação para as simulações de trade-off que cruzam Área/Produto. Novidades da versão 5.0 (ainda vigentes): Versão do manual sob a marca Compasso. Novidades acumuladas nesta revisão: tela de Fechamento Ano Fiscal (menu Ano Fiscal), com duas abas — a avaliação consolidada do ano com o botão "Fechar Ano Fiscal" (fechamento formal, com log, distinto do fechamento do orçamento) e a decisão projeto a projeto (Carryover Desenvolvimento / Carryover Hold / Cancelar / Reverter) — substituindo a antiga tela "Projetos Carry Over"; o seletor de Ano Fiscal do Dashboard/Roadmap/Financeiro/Consulta passa a ser alimentado pela configuração de Anos Fiscais (lista de todos os AFs cadastrados + "Todos" + "Pipeline"), não mais pela data do dia; o Quadro de Orçamento ganhou duas linhas de contagem de projetos e separou o Carry Over em "Em Andamento" e "Em Hold"; o quadro "Projetos na Criação do Ano Fiscal" ganhou a linha de cancelados; o Detalhamento do Projeto teve o cabeçalho reorganizado e ganhou a seção "Decisões de Fechamento"; e o Termo de Aceite do Go-Live passou a ser pré-requisito real da conclusão do projeto, não podendo ser registrado antes dos 100% de evolução. Novidades das revisões anteriores, ainda vigentes: papel PROPRIETÁRIO e Licenciamento de Módulos; permissões por atividade com quatro verbos (Consultar, Incluir, Alterar, Deletar); proteção no banco de dados (RLS) ativada nas tabelas centrais de controle de acesso; Cadastro de Produtos e associação obrigatória de Produto à demanda; Agrupamento de Orçamento por Ano Fiscal, Área ou Produto; tela de Ajuste de Orçamento; e padronização de nomenclatura (Ano Fiscal, Requerimentos, Especificação, Execução, Retorno/Benefícios de Projeto).</w:t>
+        <w:t>Novidades da versão 9.0: nova caixa "Ignora Restrição de Área" no cadastro de Funções (2.5/13.2) — exceção concedível por papel, sem dar Acesso Irrestrito; Cadastro de Produtos, Tipos de Projeto e Cargos passam a permitir editar o nome/descrição enquanto não estiverem em uso (14.5/14.6/14.9); Percentual de Bloqueio de Orçamento (15.6) passa a mostrar o valor vigente e o histórico de alterações; e a coluna Fase da Gestão do Fluxo de E-mail (15.4) mostra os nomes padronizados (Requerimentos, Especificação, Execução). Novidades da versão 8.0: nova seção inicial "Roteiro de Instalação e Primeira Configuração" — a ordem recomendada de cadastros numa instalação nova, do cadastro da empresa licenciada e dos módulos (feito pela Cognitionis) até a base pronta para a primeira demanda (feito pelo Administrador do cliente); e "Ferramentas de Dev" passou a ser exclusiva do PROPRIETÁRIO (antes bastava ter Acesso Irrestrito). Novidades da versão 7.0: (Proprietário) "Dados da Empresa Licenciada" (2.7) — cadastro da empresa que licenciou o Compasso, com nome/logo/cor exibidos no login, na tela inicial e no cabeçalho, e a vigência da licença: configuração inicial bloqueante, aviso preventivo de vencimento, tela "Licença Expirada" e renovação por código assinado. O grupo de menus de cada módulo passou a vir de uma tabela de configuração (não mais fixo no código); o Financeiro agrupa todas as funções de orçamento (Controle Orçamentário, Ajuste de Orçamento, Validação de Trade-off, Aprovar Demanda Extraordinária), e Abertura/Período do Ano Fiscal são de núcleo. Novidades da versão 6.0: (Administração) "Controle Orçamentário" — parâmetro que define se o trade-off da Demanda Extraordinária considera todos os projetos do Ano Fiscal (padrão), só os da mesma Área ou só os do mesmo Produto do projeto extraordinário; (Administração) "Período do Ano Fiscal" — o mês em que o Ano Fiscal começa deixou de ser fixo (abril) e passou a ser configurável, com vigência; (Ano Fiscal) "Validação de Trade-off Extraordinário" — fila de aprovação para as simulações de trade-off que cruzam Área/Produto. Novidades da versão 5.0 (ainda vigentes): Versão do manual sob a marca Compasso. Novidades acumuladas nesta revisão: tela de Fechamento Ano Fiscal (menu Ano Fiscal), com duas abas — a avaliação consolidada do ano com o botão "Fechar Ano Fiscal" (fechamento formal, com log, distinto do fechamento do orçamento) e a decisão projeto a projeto (Carryover Desenvolvimento / Carryover Hold / Cancelar / Reverter) — substituindo a antiga tela "Projetos Carry Over"; o seletor de Ano Fiscal do Dashboard/Roadmap/Financeiro/Consulta passa a ser alimentado pela configuração de Anos Fiscais (lista de todos os AFs cadastrados + "Todos" + "Pipeline"), não mais pela data do dia; o Quadro de Orçamento ganhou duas linhas de contagem de projetos e separou o Carry Over em "Em Andamento" e "Em Hold"; o quadro "Projetos na Criação do Ano Fiscal" ganhou a linha de cancelados; o Detalhamento do Projeto teve o cabeçalho reorganizado e ganhou a seção "Decisões de Fechamento"; e o Termo de Aceite do Go-Live passou a ser pré-requisito real da conclusão do projeto, não podendo ser registrado antes dos 100% de evolução. Novidades das revisões anteriores, ainda vigentes: papel PROPRIETÁRIO e Licenciamento de Módulos; permissões por atividade com quatro verbos (Consultar, Incluir, Alterar, Deletar); proteção no banco de dados (RLS) ativada nas tabelas centrais de controle de acesso; Cadastro de Produtos e associação obrigatória de Produto à demanda; Agrupamento de Orçamento por Ano Fiscal, Área ou Produto; tela de Ajuste de Orçamento; e padronização de nomenclatura (Ano Fiscal, Requerimentos, Especificação, Execução, Retorno/Benefícios de Projeto).</w:t>
       </w:r>
     </w:p>
     <w:p>
@@ -3063,7 +3063,7 @@
     </w:p>
     <w:p>
       <w:r>
-        <w:t>Cadastro dos cargos usados no perfil de cada usuário (obrigatório na criação do usuário). Ficava em Administração e passou para Parâmetros e Cadastros.</w:t>
+        <w:t>Cadastro dos cargos usados no perfil de cada usuário (obrigatório na criação do usuário). Ficava em Administração e passou para Parâmetros e Cadastros. O nome pode ser editado enquanto o cargo ainda não estiver atribuído a nenhum usuário — depois disso, só ativar ou inativar. O cargo "ANALISTA DE TECNOLOGIA" é reservado (é o que o sistema atribui automaticamente a todo usuário novo) e não pode ser renomeado.</w:t>
       </w:r>
     </w:p>
     <w:p>

</xml_diff>